<commit_message>
Milestone 5 — Data Population (DML) And Final Submission
</commit_message>
<xml_diff>
--- a/Milestones.docx
+++ b/Milestones.docx
@@ -588,6 +588,82 @@
           </w:p>
         </w:tc>
       </w:tr>
+      <w:tr>
+        <w:tc>
+          <w:tcPr>
+            <w:tcW w:w="1818" w:type="dxa"/>
+          </w:tcPr>
+          <w:p>
+            <w:pPr>
+              <w:rPr>
+                <w:sz w:val="24"/>
+              </w:rPr>
+            </w:pPr>
+            <w:r>
+              <w:rPr>
+                <w:sz w:val="24"/>
+              </w:rPr>
+              <w:t>5</w:t>
+            </w:r>
+          </w:p>
+        </w:tc>
+        <w:tc>
+          <w:tcPr>
+            <w:tcW w:w="1890" w:type="dxa"/>
+          </w:tcPr>
+          <w:p>
+            <w:pPr>
+              <w:rPr>
+                <w:sz w:val="24"/>
+              </w:rPr>
+            </w:pPr>
+            <w:r>
+              <w:rPr>
+                <w:sz w:val="24"/>
+              </w:rPr>
+              <w:t>5.0</w:t>
+            </w:r>
+          </w:p>
+        </w:tc>
+        <w:tc>
+          <w:tcPr>
+            <w:tcW w:w="1980" w:type="dxa"/>
+          </w:tcPr>
+          <w:p>
+            <w:pPr>
+              <w:rPr>
+                <w:sz w:val="24"/>
+              </w:rPr>
+            </w:pPr>
+            <w:r>
+              <w:rPr>
+                <w:sz w:val="24"/>
+              </w:rPr>
+              <w:t>15 May,2026</w:t>
+            </w:r>
+          </w:p>
+        </w:tc>
+        <w:tc>
+          <w:tcPr>
+            <w:tcW w:w="3888" w:type="dxa"/>
+          </w:tcPr>
+          <w:p>
+            <w:pPr>
+              <w:rPr>
+                <w:sz w:val="24"/>
+              </w:rPr>
+            </w:pPr>
+            <w:r>
+              <w:rPr>
+                <w:sz w:val="24"/>
+              </w:rPr>
+              <w:t>Data Population (DML)</w:t>
+            </w:r>
+            <w:bookmarkStart w:id="0" w:name="_GoBack"/>
+            <w:bookmarkEnd w:id="0"/>
+          </w:p>
+        </w:tc>
+      </w:tr>
     </w:tbl>
     <w:p>
       <w:pPr>
@@ -598,8 +674,6 @@
           <w:szCs w:val="24"/>
         </w:rPr>
       </w:pPr>
-      <w:bookmarkStart w:id="0" w:name="_GoBack"/>
-      <w:bookmarkEnd w:id="0"/>
     </w:p>
     <w:sectPr>
       <w:pgSz w:w="12240" w:h="15840"/>
@@ -1521,7 +1595,7 @@
 </file>
 
 <file path=customXml/itemProps1.xml><?xml version="1.0" encoding="utf-8"?>
-<ds:datastoreItem xmlns:ds="http://schemas.openxmlformats.org/officeDocument/2006/customXml" ds:itemID="{622192ED-C616-44AB-A922-EB2E3D5E91A0}">
+<ds:datastoreItem xmlns:ds="http://schemas.openxmlformats.org/officeDocument/2006/customXml" ds:itemID="{7A9DFDA3-2257-4187-A4DF-CCD40773FC6D}">
   <ds:schemaRefs>
     <ds:schemaRef ds:uri="http://schemas.openxmlformats.org/officeDocument/2006/bibliography"/>
   </ds:schemaRefs>

</xml_diff>